<commit_message>
add additional Amazon lab price info
</commit_message>
<xml_diff>
--- a/files/crystalsmile medical solution.docx
+++ b/files/crystalsmile medical solution.docx
@@ -7,13 +7,21 @@
         <w:pStyle w:val="4"/>
         <w:spacing w:before="137" w:line="250" w:lineRule="auto"/>
         <w:ind w:left="3569" w:right="2313" w:hanging="883"/>
+        <w:jc w:val="center"/>
         <w:outlineLvl w:val="0"/>
         <w:rPr>
-          <w:sz w:val="48"/>
-          <w:szCs w:val="48"/>
-        </w:rPr>
-      </w:pPr>
-      <w:r>
+          <w:b/>
+          <w:bCs/>
+          <w:color w:val="0E75BD"/>
+          <w:sz w:val="40"/>
+          <w:szCs w:val="40"/>
+        </w:rPr>
+      </w:pPr>
+      <w:r>
+        <w:rPr>
+          <w:sz w:val="15"/>
+          <w:szCs w:val="15"/>
+        </w:rPr>
         <w:drawing>
           <wp:anchor distT="0" distB="0" distL="0" distR="0" simplePos="0" relativeHeight="251661312" behindDoc="0" locked="0" layoutInCell="1" allowOverlap="1">
             <wp:simplePos x="0" y="0"/>
@@ -61,8 +69,8 @@
           <w:b/>
           <w:bCs/>
           <w:color w:val="0E75BD"/>
-          <w:sz w:val="48"/>
-          <w:szCs w:val="48"/>
+          <w:sz w:val="40"/>
+          <w:szCs w:val="40"/>
         </w:rPr>
         <w:t>Price</w:t>
       </w:r>
@@ -72,8 +80,8 @@
           <w:bCs/>
           <w:color w:val="0E75BD"/>
           <w:spacing w:val="19"/>
-          <w:sz w:val="48"/>
-          <w:szCs w:val="48"/>
+          <w:sz w:val="40"/>
+          <w:szCs w:val="40"/>
         </w:rPr>
         <w:t xml:space="preserve"> </w:t>
       </w:r>
@@ -82,8 +90,8 @@
           <w:b/>
           <w:bCs/>
           <w:color w:val="0E75BD"/>
-          <w:sz w:val="48"/>
-          <w:szCs w:val="48"/>
+          <w:sz w:val="40"/>
+          <w:szCs w:val="40"/>
         </w:rPr>
         <w:t xml:space="preserve">List </w:t>
       </w:r>
@@ -93,8 +101,8 @@
           <w:bCs/>
           <w:color w:val="0E75BD"/>
           <w:spacing w:val="23"/>
-          <w:sz w:val="48"/>
-          <w:szCs w:val="48"/>
+          <w:sz w:val="40"/>
+          <w:szCs w:val="40"/>
         </w:rPr>
         <w:t xml:space="preserve">&amp; </w:t>
       </w:r>
@@ -103,19 +111,20 @@
           <w:b/>
           <w:bCs/>
           <w:color w:val="0E75BD"/>
-          <w:sz w:val="48"/>
-          <w:szCs w:val="48"/>
+          <w:sz w:val="40"/>
+          <w:szCs w:val="40"/>
         </w:rPr>
         <w:t>Scanner</w:t>
       </w:r>
       <w:r>
         <w:rPr>
+          <w:rFonts w:hint="eastAsia" w:eastAsia="SimSun"/>
           <w:b/>
           <w:bCs/>
           <w:color w:val="0E75BD"/>
-          <w:spacing w:val="23"/>
-          <w:sz w:val="48"/>
-          <w:szCs w:val="48"/>
+          <w:sz w:val="40"/>
+          <w:szCs w:val="40"/>
+          <w:lang w:val="en-US" w:eastAsia="zh-CN"/>
         </w:rPr>
         <w:t xml:space="preserve"> </w:t>
       </w:r>
@@ -124,11 +133,27 @@
           <w:b/>
           <w:bCs/>
           <w:color w:val="0E75BD"/>
-          <w:sz w:val="48"/>
-          <w:szCs w:val="48"/>
+          <w:sz w:val="40"/>
+          <w:szCs w:val="40"/>
         </w:rPr>
         <w:t>Portal</w:t>
       </w:r>
+    </w:p>
+    <w:p>
+      <w:pPr>
+        <w:pStyle w:val="4"/>
+        <w:spacing w:before="137" w:line="250" w:lineRule="auto"/>
+        <w:ind w:left="3569" w:right="2313" w:hanging="883"/>
+        <w:jc w:val="center"/>
+        <w:outlineLvl w:val="0"/>
+        <w:rPr>
+          <w:b/>
+          <w:bCs/>
+          <w:color w:val="0E75BD"/>
+          <w:sz w:val="40"/>
+          <w:szCs w:val="40"/>
+        </w:rPr>
+      </w:pPr>
     </w:p>
     <w:p>
       <w:pPr>
@@ -499,7 +524,21 @@
           <w:szCs w:val="22"/>
           <w:lang w:val="en-US" w:eastAsia="zh-CN"/>
         </w:rPr>
-        <w:t xml:space="preserve">Please call 640-230-4254, We located in New Haven,CT. </w:t>
+        <w:t>Please call 640-230-4254</w:t>
+      </w:r>
+      <w:bookmarkStart w:id="0" w:name="_GoBack"/>
+      <w:bookmarkEnd w:id="0"/>
+      <w:r>
+        <w:rPr>
+          <w:rFonts w:hint="eastAsia" w:eastAsia="SimSun"/>
+          <w:b/>
+          <w:bCs/>
+          <w:color w:val="FF0000"/>
+          <w:sz w:val="22"/>
+          <w:szCs w:val="22"/>
+          <w:lang w:val="en-US" w:eastAsia="zh-CN"/>
+        </w:rPr>
+        <w:t xml:space="preserve">, We are conveniently located in the Yale University area. </w:t>
       </w:r>
     </w:p>
     <w:p>
@@ -9148,8 +9187,6 @@
           <w:sz w:val="21"/>
         </w:rPr>
       </w:pPr>
-      <w:bookmarkStart w:id="0" w:name="_GoBack"/>
-      <w:bookmarkEnd w:id="0"/>
     </w:p>
     <w:p>
       <w:pPr>
@@ -9416,7 +9453,7 @@
     <w:lsdException w:unhideWhenUsed="0" w:uiPriority="0" w:semiHidden="0" w:name="HTML Sample"/>
     <w:lsdException w:unhideWhenUsed="0" w:uiPriority="0" w:semiHidden="0" w:name="HTML Typewriter"/>
     <w:lsdException w:unhideWhenUsed="0" w:uiPriority="0" w:semiHidden="0" w:name="HTML Variable"/>
-    <w:lsdException w:unhideWhenUsed="0" w:uiPriority="0" w:name="Normal Table"/>
+    <w:lsdException w:qFormat="1" w:unhideWhenUsed="0" w:uiPriority="0" w:name="Normal Table"/>
     <w:lsdException w:unhideWhenUsed="0" w:uiPriority="0" w:semiHidden="0" w:name="annotation subject"/>
     <w:lsdException w:unhideWhenUsed="0" w:uiPriority="0" w:semiHidden="0" w:name="Table Simple 1"/>
     <w:lsdException w:unhideWhenUsed="0" w:uiPriority="0" w:semiHidden="0" w:name="Table Simple 2"/>
@@ -9595,6 +9632,7 @@
   <w:style w:type="table" w:default="1" w:styleId="3">
     <w:name w:val="Normal Table"/>
     <w:semiHidden/>
+    <w:qFormat/>
     <w:uiPriority w:val="0"/>
     <w:tblPr>
       <w:tblCellMar>

</xml_diff>